<commit_message>
Updated SkillBridgeAI project features and UI
</commit_message>
<xml_diff>
--- a/Industrial_Training_Report_SkillBridgeAI_Dezycode_K-Scheme.docx
+++ b/Industrial_Training_Report_SkillBridgeAI_Dezycode_K-Scheme.docx
@@ -2844,20 +2844,43 @@
       </w:pPr>
     </w:p>
     <w:p>
-      <w:r>
+      <w:pPr>
+        <w:rPr>
+          <w:sz w:val="24"/>
+          <w:szCs w:val="24"/>
+        </w:rPr>
+      </w:pPr>
+      <w:r>
+        <w:rPr>
+          <w:sz w:val="24"/>
+          <w:szCs w:val="24"/>
+        </w:rPr>
         <w:t>The structure of the organization is well defined, consisting of trainers, technical experts, and management members who guide students throughout the training. The faculty members are experienced professionals with strong expertise in their respective domains:</w:t>
       </w:r>
     </w:p>
-    <w:p/>
+    <w:p>
+      <w:pPr>
+        <w:rPr>
+          <w:sz w:val="24"/>
+          <w:szCs w:val="24"/>
+        </w:rPr>
+      </w:pPr>
+    </w:p>
     <w:p>
       <w:pPr>
         <w:pStyle w:val="ListBullet"/>
         <w:ind w:left="432"/>
         <w:jc w:val="both"/>
+        <w:rPr>
+          <w:sz w:val="24"/>
+          <w:szCs w:val="24"/>
+        </w:rPr>
       </w:pPr>
       <w:r>
         <w:rPr>
           <w:b/>
+          <w:sz w:val="24"/>
+          <w:szCs w:val="24"/>
         </w:rPr>
         <w:t>Mr. Pranav Shelke – Full Stack and MERN Stack Developer</w:t>
       </w:r>
@@ -2867,10 +2890,16 @@
         <w:pStyle w:val="ListBullet"/>
         <w:ind w:left="432"/>
         <w:jc w:val="both"/>
+        <w:rPr>
+          <w:sz w:val="24"/>
+          <w:szCs w:val="24"/>
+        </w:rPr>
       </w:pPr>
       <w:r>
         <w:rPr>
           <w:b/>
+          <w:sz w:val="24"/>
+          <w:szCs w:val="24"/>
         </w:rPr>
         <w:t>Mr. Ranjit Hinge – MERN Stack Developer</w:t>
       </w:r>
@@ -2880,10 +2909,16 @@
         <w:pStyle w:val="ListBullet"/>
         <w:ind w:left="432"/>
         <w:jc w:val="both"/>
+        <w:rPr>
+          <w:sz w:val="24"/>
+          <w:szCs w:val="24"/>
+        </w:rPr>
       </w:pPr>
       <w:r>
         <w:rPr>
           <w:b/>
+          <w:sz w:val="24"/>
+          <w:szCs w:val="24"/>
         </w:rPr>
         <w:t>Mr. Harshal Dhamale – Backend Development Specialist</w:t>
       </w:r>
@@ -2897,14 +2932,26 @@
         </w:numPr>
         <w:ind w:left="432"/>
         <w:jc w:val="both"/>
+        <w:rPr>
+          <w:sz w:val="24"/>
+          <w:szCs w:val="24"/>
+        </w:rPr>
       </w:pPr>
     </w:p>
     <w:p>
       <w:pPr>
         <w:spacing w:after="160"/>
         <w:jc w:val="both"/>
-      </w:pPr>
-      <w:r>
+        <w:rPr>
+          <w:sz w:val="24"/>
+          <w:szCs w:val="24"/>
+        </w:rPr>
+      </w:pPr>
+      <w:r>
+        <w:rPr>
+          <w:sz w:val="24"/>
+          <w:szCs w:val="24"/>
+        </w:rPr>
         <w:t>These trainers are supported by management staff and technical coordinators who ensure smooth training operations.</w:t>
       </w:r>
     </w:p>
@@ -2914,6 +2961,8 @@
         <w:rPr>
           <w:b/>
           <w:color w:val="2F5597"/>
+          <w:sz w:val="24"/>
+          <w:szCs w:val="24"/>
         </w:rPr>
       </w:pPr>
     </w:p>
@@ -2923,12 +2972,16 @@
         <w:rPr>
           <w:b/>
           <w:color w:val="2F5597"/>
+          <w:sz w:val="24"/>
+          <w:szCs w:val="24"/>
         </w:rPr>
       </w:pPr>
       <w:r>
         <w:rPr>
           <w:b/>
           <w:color w:val="2F5597"/>
+          <w:sz w:val="24"/>
+          <w:szCs w:val="24"/>
         </w:rPr>
         <w:t>➢   General Layout</w:t>
       </w:r>
@@ -2936,8 +2989,16 @@
     <w:p>
       <w:pPr>
         <w:jc w:val="both"/>
-      </w:pPr>
-      <w:r>
+        <w:rPr>
+          <w:sz w:val="24"/>
+          <w:szCs w:val="24"/>
+        </w:rPr>
+      </w:pPr>
+      <w:r>
+        <w:rPr>
+          <w:sz w:val="24"/>
+          <w:szCs w:val="24"/>
+        </w:rPr>
         <w:t>The institute follows a hybrid learning environment:</w:t>
       </w:r>
     </w:p>
@@ -2946,15 +3007,42 @@
         <w:pStyle w:val="ListBullet"/>
         <w:ind w:left="432"/>
         <w:jc w:val="both"/>
+        <w:rPr>
+          <w:sz w:val="24"/>
+          <w:szCs w:val="24"/>
+        </w:rPr>
       </w:pPr>
       <w:r>
         <w:rPr>
           <w:b/>
+          <w:sz w:val="24"/>
+          <w:szCs w:val="24"/>
         </w:rPr>
         <w:t xml:space="preserve">Offline Infrastructure: </w:t>
       </w:r>
       <w:r>
+        <w:rPr>
+          <w:sz w:val="24"/>
+          <w:szCs w:val="24"/>
+        </w:rPr>
         <w:t>Classrooms and labs equipped with computers, internet facilities, and development tools. For SkillBridge AI, Dezycode provided dedicated pods for Frontend (React), Backend (Node.js), AI, and QA.</w:t>
+      </w:r>
+      <w:r>
+        <w:rPr>
+          <w:sz w:val="24"/>
+          <w:szCs w:val="24"/>
+        </w:rPr>
+        <w:t xml:space="preserve">                                                                                                     </w:t>
+      </w:r>
+      <w:r>
+        <w:t xml:space="preserve">   </w:t>
+      </w:r>
+      <w:r>
+        <w:rPr>
+          <w:sz w:val="16"/>
+          <w:szCs w:val="16"/>
+        </w:rPr>
+        <w:t xml:space="preserve">5         </w:t>
       </w:r>
     </w:p>
     <w:p>
@@ -2966,10 +3054,11 @@
         </w:numPr>
         <w:ind w:left="432"/>
         <w:jc w:val="both"/>
-      </w:pPr>
-      <w:r>
-        <w:t xml:space="preserve">                                                                                                                                                                          </w:t>
-      </w:r>
+        <w:rPr>
+          <w:sz w:val="16"/>
+          <w:szCs w:val="16"/>
+        </w:rPr>
+      </w:pPr>
     </w:p>
     <w:p>
       <w:pPr>
@@ -2986,14 +3075,63 @@
         </w:rPr>
       </w:pPr>
       <w:r>
-        <w:t xml:space="preserve">                                                                                                                                                                          </w:t>
-      </w:r>
-      <w:r>
         <w:rPr>
           <w:sz w:val="16"/>
           <w:szCs w:val="16"/>
         </w:rPr>
-        <w:t xml:space="preserve">5         </w:t>
+        <w:t xml:space="preserve">                                                                                                                                                                                                                                                                                                           </w:t>
+      </w:r>
+    </w:p>
+    <w:p>
+      <w:pPr>
+        <w:pStyle w:val="ListBullet"/>
+        <w:ind w:left="432"/>
+        <w:jc w:val="both"/>
+        <w:rPr>
+          <w:sz w:val="24"/>
+          <w:szCs w:val="24"/>
+        </w:rPr>
+      </w:pPr>
+      <w:r>
+        <w:rPr>
+          <w:b/>
+          <w:sz w:val="24"/>
+          <w:szCs w:val="24"/>
+        </w:rPr>
+        <w:t xml:space="preserve">Online Platforms: </w:t>
+      </w:r>
+      <w:r>
+        <w:rPr>
+          <w:sz w:val="24"/>
+          <w:szCs w:val="24"/>
+        </w:rPr>
+        <w:t>Training sessions are also conducted through Zoom and Microsoft Teams, allowing students to attend from remote locations. Daily stand-ups for SkillBridge AI were held on Teams.</w:t>
+      </w:r>
+    </w:p>
+    <w:p>
+      <w:pPr>
+        <w:pStyle w:val="ListBullet"/>
+        <w:ind w:left="432"/>
+        <w:jc w:val="both"/>
+        <w:rPr>
+          <w:sz w:val="24"/>
+          <w:szCs w:val="24"/>
+        </w:rPr>
+      </w:pPr>
+      <w:r>
+        <w:rPr>
+          <w:b/>
+          <w:sz w:val="24"/>
+          <w:szCs w:val="24"/>
+        </w:rPr>
+        <w:t xml:space="preserve">Digital Resources: </w:t>
+      </w:r>
+      <w:r>
+        <w:rPr>
+          <w:sz w:val="24"/>
+          <w:szCs w:val="24"/>
+        </w:rPr>
+        <w:t>Study material, project files, and coding exercises are shared with students through online platforms, ensuring continuous learning. All SkillBridge AI code was versioned on GitHub with Vercel previews.</w:t>
       </w:r>
     </w:p>
     <w:p>
@@ -3006,76 +3144,8 @@
         <w:ind w:left="432"/>
         <w:jc w:val="both"/>
         <w:rPr>
-          <w:sz w:val="16"/>
-          <w:szCs w:val="16"/>
-        </w:rPr>
-      </w:pPr>
-    </w:p>
-    <w:p>
-      <w:pPr>
-        <w:pStyle w:val="ListBullet"/>
-        <w:numPr>
-          <w:ilvl w:val="0"/>
-          <w:numId w:val="0"/>
-        </w:numPr>
-        <w:ind w:left="432"/>
-        <w:jc w:val="both"/>
-        <w:rPr>
-          <w:sz w:val="16"/>
-          <w:szCs w:val="16"/>
-        </w:rPr>
-      </w:pPr>
-      <w:r>
-        <w:rPr>
-          <w:sz w:val="16"/>
-          <w:szCs w:val="16"/>
-        </w:rPr>
-        <w:t xml:space="preserve">                                                                                                                                                                                                                                                                                                           </w:t>
-      </w:r>
-    </w:p>
-    <w:p>
-      <w:pPr>
-        <w:pStyle w:val="ListBullet"/>
-        <w:ind w:left="432"/>
-        <w:jc w:val="both"/>
-      </w:pPr>
-      <w:r>
-        <w:rPr>
-          <w:b/>
-        </w:rPr>
-        <w:t xml:space="preserve">Online Platforms: </w:t>
-      </w:r>
-      <w:r>
-        <w:t>Training sessions are also conducted through Zoom and Microsoft Teams, allowing students to attend from remote locations. Daily stand-ups for SkillBridge AI were held on Teams.</w:t>
-      </w:r>
-    </w:p>
-    <w:p>
-      <w:pPr>
-        <w:pStyle w:val="ListBullet"/>
-        <w:ind w:left="432"/>
-        <w:jc w:val="both"/>
-      </w:pPr>
-      <w:r>
-        <w:rPr>
-          <w:b/>
-        </w:rPr>
-        <w:t xml:space="preserve">Digital Resources: </w:t>
-      </w:r>
-      <w:r>
-        <w:t>Study material, project files, and coding exercises are shared with students through online platforms, ensuring continuous learning. All SkillBridge AI code was versioned on GitHub with Vercel previews.</w:t>
-      </w:r>
-    </w:p>
-    <w:p>
-      <w:pPr>
-        <w:pStyle w:val="ListBullet"/>
-        <w:numPr>
-          <w:ilvl w:val="0"/>
-          <w:numId w:val="0"/>
-        </w:numPr>
-        <w:ind w:left="432"/>
-        <w:jc w:val="both"/>
-        <w:rPr>
-          <w:sz w:val="12"/>
+          <w:sz w:val="24"/>
+          <w:szCs w:val="24"/>
         </w:rPr>
       </w:pPr>
     </w:p>
@@ -3085,7 +3155,14 @@
         <w:jc w:val="both"/>
       </w:pPr>
       <w:r>
-        <w:t>This combination of classroom learning and digital training ensures that students get both theoretical and practical exposure to industry-level technologies.</w:t>
+        <w:rPr>
+          <w:sz w:val="24"/>
+          <w:szCs w:val="24"/>
+        </w:rPr>
+        <w:t>This combination of classroom learning and digital training ensures that students get both theoretical and practical exposure to industry-level technologies</w:t>
+      </w:r>
+      <w:r>
+        <w:t>.</w:t>
       </w:r>
     </w:p>
     <w:p>
@@ -3280,17 +3357,13 @@
     <w:p>
       <w:pPr>
         <w:spacing w:before="360"/>
-        <w:jc w:val="right"/>
+      </w:pPr>
+      <w:r>
         <w:rPr>
           <w:sz w:val="16"/>
         </w:rPr>
-      </w:pPr>
-    </w:p>
-    <w:p>
-      <w:pPr>
-        <w:spacing w:before="360"/>
-        <w:jc w:val="right"/>
-      </w:pPr>
+        <w:t xml:space="preserve">                                                                                                                                                                                                                                                     </w:t>
+      </w:r>
       <w:r>
         <w:rPr>
           <w:sz w:val="16"/>
@@ -3446,7 +3519,21 @@
           <w:sz w:val="24"/>
           <w:szCs w:val="24"/>
         </w:rPr>
-        <w:t>The organization, situated at Akurdi , Pune – 411035, is a reputed institute engaged in providing Web Development, App Development , UI/UX Design, Software Development , SEO Optimization and Technical Training — now scaling as Dezycode, a product studio for AI-powered platforms like SkillBridge AI. It aims to create a strong foundation for students and professionals by equipping them with practical knowledge of industry technologies.</w:t>
+        <w:t xml:space="preserve">The </w:t>
+      </w:r>
+      <w:r>
+        <w:rPr>
+          <w:sz w:val="24"/>
+          <w:szCs w:val="24"/>
+        </w:rPr>
+        <w:t>organization, situated at Kharadi</w:t>
+      </w:r>
+      <w:r>
+        <w:rPr>
+          <w:sz w:val="24"/>
+          <w:szCs w:val="24"/>
+        </w:rPr>
+        <w:t xml:space="preserve"> , Pune – 411035, is a reputed institute engaged in providing Web Development, App Development , UI/UX Design, Software Development , SEO Optimization and Technical Training — now scaling as Dezycode, a product studio for AI-powered platforms like SkillBridge AI. It aims to create a strong foundation for students and professionals by equipping them with practical knowledge of industry technologies.</w:t>
       </w:r>
     </w:p>
     <w:p>
@@ -3492,7 +3579,21 @@
           <w:sz w:val="24"/>
           <w:szCs w:val="24"/>
         </w:rPr>
-        <w:t>The institute was established with the vision of bridging the gap between academic learning and industrial requirements. Over the years, it has grown into a recognized training center, contributing to the professional development of numerous students from Information Technology and related domains. In 2019, the core team incorporated as Dezycode to build scalable products — culminating in 2025 with SkillBridge AI, an AI-driven career intelligence platform connecting students, mentors, and recruiters.</w:t>
+        <w:t>The institute was established with the vision of bridging the gap between academic learning and industrial requirements. Over the years, it has grown into a recognized training center, contributing to the professional development of numerous students from Information Technology and related domains. In 2019, the core team incorporated as Dezycode to build scalable products — culminating in 20</w:t>
+      </w:r>
+      <w:r>
+        <w:rPr>
+          <w:sz w:val="24"/>
+          <w:szCs w:val="24"/>
+        </w:rPr>
+        <w:t>26</w:t>
+      </w:r>
+      <w:r>
+        <w:rPr>
+          <w:sz w:val="24"/>
+          <w:szCs w:val="24"/>
+        </w:rPr>
+        <w:t xml:space="preserve"> with SkillBridge AI, an AI-driven career intelligence platform connecting students, mentors, and recruiters.</w:t>
       </w:r>
     </w:p>
     <w:p>
@@ -8490,6 +8591,16 @@
     </w:p>
     <w:p>
       <w:pPr>
+        <w:ind w:left="288"/>
+        <w:jc w:val="both"/>
+        <w:rPr>
+          <w:sz w:val="24"/>
+          <w:szCs w:val="24"/>
+        </w:rPr>
+      </w:pPr>
+    </w:p>
+    <w:p>
+      <w:pPr>
         <w:spacing w:before="160" w:after="120"/>
         <w:rPr>
           <w:sz w:val="24"/>
@@ -8617,15 +8728,6 @@
         </w:rPr>
         <w:t>•  SavedItems (Local + DB): Bookmark persistence for internships/courses via bookmark.js and localStorage.</w:t>
       </w:r>
-    </w:p>
-    <w:p>
-      <w:pPr>
-        <w:spacing w:before="160"/>
-        <w:jc w:val="right"/>
-        <w:rPr>
-          <w:sz w:val="16"/>
-        </w:rPr>
-      </w:pPr>
     </w:p>
     <w:p>
       <w:pPr>
@@ -12588,17 +12690,28 @@
       <w:pPr>
         <w:spacing w:before="160" w:after="120"/>
         <w:rPr>
-          <w:sz w:val="24"/>
-          <w:szCs w:val="24"/>
-        </w:rPr>
-      </w:pPr>
-      <w:r>
-        <w:rPr>
           <w:b/>
           <w:color w:val="2F5597"/>
           <w:sz w:val="24"/>
           <w:szCs w:val="24"/>
         </w:rPr>
+      </w:pPr>
+    </w:p>
+    <w:p>
+      <w:pPr>
+        <w:spacing w:before="160" w:after="120"/>
+        <w:rPr>
+          <w:sz w:val="24"/>
+          <w:szCs w:val="24"/>
+        </w:rPr>
+      </w:pPr>
+      <w:r>
+        <w:rPr>
+          <w:b/>
+          <w:color w:val="2F5597"/>
+          <w:sz w:val="24"/>
+          <w:szCs w:val="24"/>
+        </w:rPr>
         <w:t>Tools &amp; Platforms</w:t>
       </w:r>
     </w:p>
@@ -12729,15 +12842,6 @@
         </w:rPr>
         <w:t>8. Vercel &amp; Render – Hosting for SkillBridge AI (ai-ten-ivory.vercel.app).</w:t>
       </w:r>
-    </w:p>
-    <w:p>
-      <w:pPr>
-        <w:spacing w:before="360"/>
-        <w:jc w:val="right"/>
-        <w:rPr>
-          <w:sz w:val="16"/>
-        </w:rPr>
-      </w:pPr>
     </w:p>
     <w:p>
       <w:pPr>
@@ -13520,6 +13624,7 @@
   <w:style w:type="character" w:default="1" w:styleId="DefaultParagraphFont">
     <w:name w:val="Default Paragraph Font"/>
     <w:uiPriority w:val="1"/>
+    <w:semiHidden/>
     <w:unhideWhenUsed/>
   </w:style>
   <w:style w:type="table" w:default="1" w:styleId="TableNormal">

</xml_diff>